<commit_message>
docs(stream): the sim profile campaign on stream's own firmware, against the board
results/sim/ (40 cells, both designs, the 2026-10-25 bitstreams): STREAM is
the board to the cycle on all 96 points; stream-g differs by 16 cycles on
average and 51 at most, under one poll pass, where the first image gave 24
and 190 (a whole COMPLETE / NEXT_DESC walk, TASK-021). Board book 1.4's
simulation-against-the-board paragraph rewritten on those numbers; PDF rebuilt.
</commit_message>
<xml_diff>
--- a/projects/fpga-systems/Genesys2/dma-ip/stream/docs/STREAM_FPGA_System_v1.4.docx
+++ b/projects/fpga-systems/Genesys2/dma-ip/stream/docs/STREAM_FPGA_System_v1.4.docx
@@ -160,7 +160,7 @@
             </w:rPr>
             <w:fldChar w:fldCharType="separate"/>
           </w:r>
-          <w:hyperlink w:anchor="__RefHeading___Toc9430_1024129965">
+          <w:hyperlink w:anchor="__RefHeading___Toc9410_1952650900">
             <w:r>
               <w:rPr>
                 <w:webHidden/>
@@ -181,7 +181,7 @@
             </w:tabs>
             <w:rPr/>
           </w:pPr>
-          <w:hyperlink w:anchor="__RefHeading___Toc9432_1024129965">
+          <w:hyperlink w:anchor="__RefHeading___Toc9412_1952650900">
             <w:r>
               <w:rPr>
                 <w:webHidden/>
@@ -202,7 +202,7 @@
             </w:tabs>
             <w:rPr/>
           </w:pPr>
-          <w:hyperlink w:anchor="__RefHeading___Toc9434_1024129965">
+          <w:hyperlink w:anchor="__RefHeading___Toc9414_1952650900">
             <w:r>
               <w:rPr>
                 <w:webHidden/>
@@ -223,7 +223,7 @@
             </w:tabs>
             <w:rPr/>
           </w:pPr>
-          <w:hyperlink w:anchor="__RefHeading___Toc9436_1024129965">
+          <w:hyperlink w:anchor="__RefHeading___Toc9416_1952650900">
             <w:r>
               <w:rPr>
                 <w:webHidden/>
@@ -244,7 +244,7 @@
             </w:tabs>
             <w:rPr/>
           </w:pPr>
-          <w:hyperlink w:anchor="__RefHeading___Toc9438_1024129965">
+          <w:hyperlink w:anchor="__RefHeading___Toc9418_1952650900">
             <w:r>
               <w:rPr>
                 <w:webHidden/>
@@ -265,7 +265,7 @@
             </w:tabs>
             <w:rPr/>
           </w:pPr>
-          <w:hyperlink w:anchor="__RefHeading___Toc9440_1024129965">
+          <w:hyperlink w:anchor="__RefHeading___Toc9420_1952650900">
             <w:r>
               <w:rPr>
                 <w:webHidden/>
@@ -286,7 +286,7 @@
             </w:tabs>
             <w:rPr/>
           </w:pPr>
-          <w:hyperlink w:anchor="__RefHeading___Toc9442_1024129965">
+          <w:hyperlink w:anchor="__RefHeading___Toc9422_1952650900">
             <w:r>
               <w:rPr>
                 <w:webHidden/>
@@ -307,7 +307,7 @@
             </w:tabs>
             <w:rPr/>
           </w:pPr>
-          <w:hyperlink w:anchor="__RefHeading___Toc9444_1024129965">
+          <w:hyperlink w:anchor="__RefHeading___Toc9424_1952650900">
             <w:r>
               <w:rPr>
                 <w:webHidden/>
@@ -328,7 +328,7 @@
             </w:tabs>
             <w:rPr/>
           </w:pPr>
-          <w:hyperlink w:anchor="__RefHeading___Toc9446_1024129965">
+          <w:hyperlink w:anchor="__RefHeading___Toc9426_1952650900">
             <w:r>
               <w:rPr>
                 <w:webHidden/>
@@ -349,7 +349,7 @@
             </w:tabs>
             <w:rPr/>
           </w:pPr>
-          <w:hyperlink w:anchor="__RefHeading___Toc9448_1024129965">
+          <w:hyperlink w:anchor="__RefHeading___Toc9428_1952650900">
             <w:r>
               <w:rPr>
                 <w:webHidden/>
@@ -370,7 +370,7 @@
             </w:tabs>
             <w:rPr/>
           </w:pPr>
-          <w:hyperlink w:anchor="__RefHeading___Toc9450_1024129965">
+          <w:hyperlink w:anchor="__RefHeading___Toc9430_1952650900">
             <w:r>
               <w:rPr>
                 <w:webHidden/>
@@ -391,7 +391,7 @@
             </w:tabs>
             <w:rPr/>
           </w:pPr>
-          <w:hyperlink w:anchor="__RefHeading___Toc9452_1024129965">
+          <w:hyperlink w:anchor="__RefHeading___Toc9432_1952650900">
             <w:r>
               <w:rPr>
                 <w:webHidden/>
@@ -412,7 +412,7 @@
             </w:tabs>
             <w:rPr/>
           </w:pPr>
-          <w:hyperlink w:anchor="__RefHeading___Toc9454_1024129965">
+          <w:hyperlink w:anchor="__RefHeading___Toc9434_1952650900">
             <w:r>
               <w:rPr>
                 <w:webHidden/>
@@ -433,7 +433,7 @@
             </w:tabs>
             <w:rPr/>
           </w:pPr>
-          <w:hyperlink w:anchor="__RefHeading___Toc9456_1024129965">
+          <w:hyperlink w:anchor="__RefHeading___Toc9436_1952650900">
             <w:r>
               <w:rPr>
                 <w:webHidden/>
@@ -454,7 +454,7 @@
             </w:tabs>
             <w:rPr/>
           </w:pPr>
-          <w:hyperlink w:anchor="__RefHeading___Toc9458_1024129965">
+          <w:hyperlink w:anchor="__RefHeading___Toc9438_1952650900">
             <w:r>
               <w:rPr>
                 <w:webHidden/>
@@ -475,7 +475,7 @@
             </w:tabs>
             <w:rPr/>
           </w:pPr>
-          <w:hyperlink w:anchor="__RefHeading___Toc9460_1024129965">
+          <w:hyperlink w:anchor="__RefHeading___Toc9440_1952650900">
             <w:r>
               <w:rPr>
                 <w:webHidden/>
@@ -496,7 +496,7 @@
             </w:tabs>
             <w:rPr/>
           </w:pPr>
-          <w:hyperlink w:anchor="__RefHeading___Toc9462_1024129965">
+          <w:hyperlink w:anchor="__RefHeading___Toc9442_1952650900">
             <w:r>
               <w:rPr>
                 <w:webHidden/>
@@ -517,7 +517,7 @@
             </w:tabs>
             <w:rPr/>
           </w:pPr>
-          <w:hyperlink w:anchor="__RefHeading___Toc9464_1024129965">
+          <w:hyperlink w:anchor="__RefHeading___Toc9444_1952650900">
             <w:r>
               <w:rPr>
                 <w:webHidden/>
@@ -538,7 +538,7 @@
             </w:tabs>
             <w:rPr/>
           </w:pPr>
-          <w:hyperlink w:anchor="__RefHeading___Toc9466_1024129965">
+          <w:hyperlink w:anchor="__RefHeading___Toc9446_1952650900">
             <w:r>
               <w:rPr>
                 <w:webHidden/>
@@ -559,7 +559,7 @@
             </w:tabs>
             <w:rPr/>
           </w:pPr>
-          <w:hyperlink w:anchor="__RefHeading___Toc9468_1024129965">
+          <w:hyperlink w:anchor="__RefHeading___Toc9448_1952650900">
             <w:r>
               <w:rPr>
                 <w:webHidden/>
@@ -580,7 +580,7 @@
             </w:tabs>
             <w:rPr/>
           </w:pPr>
-          <w:hyperlink w:anchor="__RefHeading___Toc9470_1024129965">
+          <w:hyperlink w:anchor="__RefHeading___Toc9450_1952650900">
             <w:r>
               <w:rPr>
                 <w:webHidden/>
@@ -601,7 +601,7 @@
             </w:tabs>
             <w:rPr/>
           </w:pPr>
-          <w:hyperlink w:anchor="__RefHeading___Toc9472_1024129965">
+          <w:hyperlink w:anchor="__RefHeading___Toc9452_1952650900">
             <w:r>
               <w:rPr>
                 <w:webHidden/>
@@ -622,7 +622,7 @@
             </w:tabs>
             <w:rPr/>
           </w:pPr>
-          <w:hyperlink w:anchor="__RefHeading___Toc9474_1024129965">
+          <w:hyperlink w:anchor="__RefHeading___Toc9454_1952650900">
             <w:r>
               <w:rPr>
                 <w:webHidden/>
@@ -643,7 +643,7 @@
             </w:tabs>
             <w:rPr/>
           </w:pPr>
-          <w:hyperlink w:anchor="__RefHeading___Toc9476_1024129965">
+          <w:hyperlink w:anchor="__RefHeading___Toc9456_1952650900">
             <w:r>
               <w:rPr>
                 <w:webHidden/>
@@ -664,7 +664,7 @@
             </w:tabs>
             <w:rPr/>
           </w:pPr>
-          <w:hyperlink w:anchor="__RefHeading___Toc9478_1024129965">
+          <w:hyperlink w:anchor="__RefHeading___Toc9458_1952650900">
             <w:r>
               <w:rPr>
                 <w:webHidden/>
@@ -685,7 +685,7 @@
             </w:tabs>
             <w:rPr/>
           </w:pPr>
-          <w:hyperlink w:anchor="__RefHeading___Toc9480_1024129965">
+          <w:hyperlink w:anchor="__RefHeading___Toc9460_1952650900">
             <w:r>
               <w:rPr>
                 <w:webHidden/>
@@ -706,7 +706,7 @@
             </w:tabs>
             <w:rPr/>
           </w:pPr>
-          <w:hyperlink w:anchor="__RefHeading___Toc9482_1024129965">
+          <w:hyperlink w:anchor="__RefHeading___Toc9462_1952650900">
             <w:r>
               <w:rPr>
                 <w:webHidden/>
@@ -727,7 +727,7 @@
             </w:tabs>
             <w:rPr/>
           </w:pPr>
-          <w:hyperlink w:anchor="__RefHeading___Toc9484_1024129965">
+          <w:hyperlink w:anchor="__RefHeading___Toc9464_1952650900">
             <w:r>
               <w:rPr>
                 <w:webHidden/>
@@ -748,7 +748,7 @@
             </w:tabs>
             <w:rPr/>
           </w:pPr>
-          <w:hyperlink w:anchor="__RefHeading___Toc9486_1024129965">
+          <w:hyperlink w:anchor="__RefHeading___Toc9466_1952650900">
             <w:r>
               <w:rPr>
                 <w:webHidden/>
@@ -769,7 +769,7 @@
             </w:tabs>
             <w:rPr/>
           </w:pPr>
-          <w:hyperlink w:anchor="__RefHeading___Toc9488_1024129965">
+          <w:hyperlink w:anchor="__RefHeading___Toc9468_1952650900">
             <w:r>
               <w:rPr>
                 <w:webHidden/>
@@ -790,7 +790,7 @@
             </w:tabs>
             <w:rPr/>
           </w:pPr>
-          <w:hyperlink w:anchor="__RefHeading___Toc9490_1024129965">
+          <w:hyperlink w:anchor="__RefHeading___Toc9470_1952650900">
             <w:r>
               <w:rPr>
                 <w:webHidden/>
@@ -811,7 +811,7 @@
             </w:tabs>
             <w:rPr/>
           </w:pPr>
-          <w:hyperlink w:anchor="__RefHeading___Toc9492_1024129965">
+          <w:hyperlink w:anchor="__RefHeading___Toc9472_1952650900">
             <w:r>
               <w:rPr>
                 <w:webHidden/>
@@ -832,7 +832,7 @@
             </w:tabs>
             <w:rPr/>
           </w:pPr>
-          <w:hyperlink w:anchor="__RefHeading___Toc9494_1024129965">
+          <w:hyperlink w:anchor="__RefHeading___Toc9474_1952650900">
             <w:r>
               <w:rPr>
                 <w:webHidden/>
@@ -853,7 +853,7 @@
             </w:tabs>
             <w:rPr/>
           </w:pPr>
-          <w:hyperlink w:anchor="__RefHeading___Toc9496_1024129965">
+          <w:hyperlink w:anchor="__RefHeading___Toc9476_1952650900">
             <w:r>
               <w:rPr>
                 <w:webHidden/>
@@ -874,7 +874,7 @@
             </w:tabs>
             <w:rPr/>
           </w:pPr>
-          <w:hyperlink w:anchor="__RefHeading___Toc9498_1024129965">
+          <w:hyperlink w:anchor="__RefHeading___Toc9478_1952650900">
             <w:r>
               <w:rPr>
                 <w:webHidden/>
@@ -895,7 +895,7 @@
             </w:tabs>
             <w:rPr/>
           </w:pPr>
-          <w:hyperlink w:anchor="__RefHeading___Toc9500_1024129965">
+          <w:hyperlink w:anchor="__RefHeading___Toc9480_1952650900">
             <w:r>
               <w:rPr>
                 <w:webHidden/>
@@ -916,7 +916,7 @@
             </w:tabs>
             <w:rPr/>
           </w:pPr>
-          <w:hyperlink w:anchor="__RefHeading___Toc9502_1024129965">
+          <w:hyperlink w:anchor="__RefHeading___Toc9482_1952650900">
             <w:r>
               <w:rPr>
                 <w:webHidden/>
@@ -937,7 +937,7 @@
             </w:tabs>
             <w:rPr/>
           </w:pPr>
-          <w:hyperlink w:anchor="__RefHeading___Toc9504_1024129965">
+          <w:hyperlink w:anchor="__RefHeading___Toc9484_1952650900">
             <w:r>
               <w:rPr>
                 <w:webHidden/>
@@ -958,7 +958,7 @@
             </w:tabs>
             <w:rPr/>
           </w:pPr>
-          <w:hyperlink w:anchor="__RefHeading___Toc9506_1024129965">
+          <w:hyperlink w:anchor="__RefHeading___Toc9486_1952650900">
             <w:r>
               <w:rPr>
                 <w:webHidden/>
@@ -979,7 +979,7 @@
             </w:tabs>
             <w:rPr/>
           </w:pPr>
-          <w:hyperlink w:anchor="__RefHeading___Toc9508_1024129965">
+          <w:hyperlink w:anchor="__RefHeading___Toc9488_1952650900">
             <w:r>
               <w:rPr>
                 <w:webHidden/>
@@ -1000,7 +1000,7 @@
             </w:tabs>
             <w:rPr/>
           </w:pPr>
-          <w:hyperlink w:anchor="__RefHeading___Toc9510_1024129965">
+          <w:hyperlink w:anchor="__RefHeading___Toc9490_1952650900">
             <w:r>
               <w:rPr>
                 <w:webHidden/>
@@ -1021,7 +1021,7 @@
             </w:tabs>
             <w:rPr/>
           </w:pPr>
-          <w:hyperlink w:anchor="__RefHeading___Toc9512_1024129965">
+          <w:hyperlink w:anchor="__RefHeading___Toc9492_1952650900">
             <w:r>
               <w:rPr>
                 <w:webHidden/>
@@ -1042,7 +1042,7 @@
             </w:tabs>
             <w:rPr/>
           </w:pPr>
-          <w:hyperlink w:anchor="__RefHeading___Toc9514_1024129965">
+          <w:hyperlink w:anchor="__RefHeading___Toc9494_1952650900">
             <w:r>
               <w:rPr>
                 <w:webHidden/>
@@ -1063,7 +1063,7 @@
             </w:tabs>
             <w:rPr/>
           </w:pPr>
-          <w:hyperlink w:anchor="__RefHeading___Toc9516_1024129965">
+          <w:hyperlink w:anchor="__RefHeading___Toc9496_1952650900">
             <w:r>
               <w:rPr>
                 <w:webHidden/>
@@ -1084,7 +1084,7 @@
             </w:tabs>
             <w:rPr/>
           </w:pPr>
-          <w:hyperlink w:anchor="__RefHeading___Toc9518_1024129965">
+          <w:hyperlink w:anchor="__RefHeading___Toc9498_1952650900">
             <w:r>
               <w:rPr>
                 <w:webHidden/>
@@ -1105,7 +1105,7 @@
             </w:tabs>
             <w:rPr/>
           </w:pPr>
-          <w:hyperlink w:anchor="__RefHeading___Toc9520_1024129965">
+          <w:hyperlink w:anchor="__RefHeading___Toc9500_1952650900">
             <w:r>
               <w:rPr>
                 <w:webHidden/>
@@ -1126,7 +1126,7 @@
             </w:tabs>
             <w:rPr/>
           </w:pPr>
-          <w:hyperlink w:anchor="__RefHeading___Toc9522_1024129965">
+          <w:hyperlink w:anchor="__RefHeading___Toc9502_1952650900">
             <w:r>
               <w:rPr>
                 <w:webHidden/>
@@ -3032,7 +3032,7 @@
         <w:spacing w:before="360" w:after="120"/>
         <w:rPr/>
       </w:pPr>
-      <w:bookmarkStart w:id="0" w:name="__RefHeading___Toc9430_1024129965"/>
+      <w:bookmarkStart w:id="0" w:name="__RefHeading___Toc9410_1952650900"/>
       <w:bookmarkStart w:id="1" w:name="document-information"/>
       <w:bookmarkEnd w:id="0"/>
       <w:r>
@@ -3625,7 +3625,7 @@
       <w:r>
         <w:br w:type="page"/>
       </w:r>
-      <w:bookmarkStart w:id="3" w:name="__RefHeading___Toc9432_1024129965"/>
+      <w:bookmarkStart w:id="3" w:name="__RefHeading___Toc9412_1952650900"/>
       <w:bookmarkEnd w:id="3"/>
       <w:r>
         <w:rPr>
@@ -4484,7 +4484,7 @@
       <w:r>
         <w:br w:type="page"/>
       </w:r>
-      <w:bookmarkStart w:id="5" w:name="__RefHeading___Toc9434_1024129965"/>
+      <w:bookmarkStart w:id="5" w:name="__RefHeading___Toc9414_1952650900"/>
       <w:bookmarkEnd w:id="5"/>
       <w:r>
         <w:rPr>
@@ -4640,7 +4640,7 @@
         <w:spacing w:before="360" w:after="120"/>
         <w:rPr/>
       </w:pPr>
-      <w:bookmarkStart w:id="7" w:name="__RefHeading___Toc9436_1024129965"/>
+      <w:bookmarkStart w:id="7" w:name="__RefHeading___Toc9416_1952650900"/>
       <w:bookmarkStart w:id="8" w:name="the-system"/>
       <w:bookmarkEnd w:id="7"/>
       <w:r>
@@ -4672,7 +4672,7 @@
         <w:spacing w:before="280" w:after="80"/>
         <w:rPr/>
       </w:pPr>
-      <w:bookmarkStart w:id="9" w:name="__RefHeading___Toc9438_1024129965"/>
+      <w:bookmarkStart w:id="9" w:name="__RefHeading___Toc9418_1952650900"/>
       <w:bookmarkStart w:id="10" w:name="what-it-is"/>
       <w:bookmarkEnd w:id="9"/>
       <w:r>
@@ -4724,7 +4724,7 @@
         <w:spacing w:before="200" w:after="80"/>
         <w:rPr/>
       </w:pPr>
-      <w:bookmarkStart w:id="11" w:name="__RefHeading___Toc9440_1024129965"/>
+      <w:bookmarkStart w:id="11" w:name="__RefHeading___Toc9420_1952650900"/>
       <w:bookmarkStart w:id="12" w:name="figure-1.1-the-bench"/>
       <w:bookmarkStart w:id="13" w:name="_Fig_1_The_bench"/>
       <w:bookmarkEnd w:id="11"/>
@@ -4846,7 +4846,7 @@
         <w:spacing w:before="280" w:after="80"/>
         <w:rPr/>
       </w:pPr>
-      <w:bookmarkStart w:id="14" w:name="__RefHeading___Toc9442_1024129965"/>
+      <w:bookmarkStart w:id="14" w:name="__RefHeading___Toc9422_1952650900"/>
       <w:bookmarkEnd w:id="14"/>
       <w:r>
         <w:rPr>
@@ -5487,7 +5487,7 @@
       <w:r>
         <w:br w:type="page"/>
       </w:r>
-      <w:bookmarkStart w:id="17" w:name="__RefHeading___Toc9444_1024129965"/>
+      <w:bookmarkStart w:id="17" w:name="__RefHeading___Toc9424_1952650900"/>
       <w:bookmarkEnd w:id="17"/>
       <w:r>
         <w:rPr>
@@ -5597,7 +5597,7 @@
         <w:spacing w:before="280" w:after="80"/>
         <w:rPr/>
       </w:pPr>
-      <w:bookmarkStart w:id="18" w:name="__RefHeading___Toc9446_1024129965"/>
+      <w:bookmarkStart w:id="18" w:name="__RefHeading___Toc9426_1952650900"/>
       <w:bookmarkStart w:id="19" w:name="the-stack-top-to-bottom"/>
       <w:bookmarkEnd w:id="18"/>
       <w:r>
@@ -6143,7 +6143,7 @@
         <w:spacing w:before="280" w:after="80"/>
         <w:rPr/>
       </w:pPr>
-      <w:bookmarkStart w:id="21" w:name="__RefHeading___Toc9448_1024129965"/>
+      <w:bookmarkStart w:id="21" w:name="__RefHeading___Toc9428_1952650900"/>
       <w:bookmarkStart w:id="22" w:name="what-the-host-sees"/>
       <w:bookmarkEnd w:id="21"/>
       <w:r>
@@ -6289,7 +6289,7 @@
         <w:spacing w:before="360" w:after="120"/>
         <w:rPr/>
       </w:pPr>
-      <w:bookmarkStart w:id="25" w:name="__RefHeading___Toc9450_1024129965"/>
+      <w:bookmarkStart w:id="25" w:name="__RefHeading___Toc9430_1952650900"/>
       <w:bookmarkStart w:id="26" w:name="the-harness"/>
       <w:bookmarkEnd w:id="25"/>
       <w:r>
@@ -6336,7 +6336,7 @@
         <w:spacing w:before="200" w:after="80"/>
         <w:rPr/>
       </w:pPr>
-      <w:bookmarkStart w:id="27" w:name="__RefHeading___Toc9452_1024129965"/>
+      <w:bookmarkStart w:id="27" w:name="__RefHeading___Toc9432_1952650900"/>
       <w:bookmarkStart w:id="28" w:name="figure-2.1-the-harness-block-map"/>
       <w:bookmarkStart w:id="29" w:name="_Fig_2_The_harness_block_ma"/>
       <w:bookmarkEnd w:id="27"/>
@@ -6508,7 +6508,7 @@
         <w:spacing w:before="280" w:after="80"/>
         <w:rPr/>
       </w:pPr>
-      <w:bookmarkStart w:id="30" w:name="__RefHeading___Toc9454_1024129965"/>
+      <w:bookmarkStart w:id="30" w:name="__RefHeading___Toc9434_1952650900"/>
       <w:bookmarkStart w:id="31" w:name="the-host-front-end-and-the-bridge"/>
       <w:bookmarkEnd w:id="30"/>
       <w:r>
@@ -6640,7 +6640,7 @@
         <w:spacing w:before="280" w:after="80"/>
         <w:rPr/>
       </w:pPr>
-      <w:bookmarkStart w:id="32" w:name="__RefHeading___Toc9456_1024129965"/>
+      <w:bookmarkStart w:id="32" w:name="__RefHeading___Toc9436_1952650900"/>
       <w:bookmarkStart w:id="33" w:name="the-harness-csr"/>
       <w:bookmarkEnd w:id="32"/>
       <w:r>
@@ -7480,7 +7480,7 @@
         <w:spacing w:before="280" w:after="80"/>
         <w:rPr/>
       </w:pPr>
-      <w:bookmarkStart w:id="35" w:name="__RefHeading___Toc9458_1024129965"/>
+      <w:bookmarkStart w:id="35" w:name="__RefHeading___Toc9438_1952650900"/>
       <w:bookmarkStart w:id="36" w:name="the-run-timer-and-the-verdict"/>
       <w:bookmarkEnd w:id="35"/>
       <w:r>
@@ -7703,7 +7703,7 @@
         <w:spacing w:before="280" w:after="80"/>
         <w:rPr/>
       </w:pPr>
-      <w:bookmarkStart w:id="37" w:name="__RefHeading___Toc9460_1024129965"/>
+      <w:bookmarkStart w:id="37" w:name="__RefHeading___Toc9440_1952650900"/>
       <w:bookmarkEnd w:id="37"/>
       <w:r>
         <w:rPr>
@@ -8092,7 +8092,7 @@
       <w:r>
         <w:br w:type="page"/>
       </w:r>
-      <w:bookmarkStart w:id="40" w:name="__RefHeading___Toc9462_1024129965"/>
+      <w:bookmarkStart w:id="40" w:name="__RefHeading___Toc9442_1952650900"/>
       <w:bookmarkEnd w:id="40"/>
       <w:r>
         <w:rPr>
@@ -8413,7 +8413,7 @@
         <w:spacing w:before="360" w:after="120"/>
         <w:rPr/>
       </w:pPr>
-      <w:bookmarkStart w:id="42" w:name="__RefHeading___Toc9464_1024129965"/>
+      <w:bookmarkStart w:id="42" w:name="__RefHeading___Toc9444_1952650900"/>
       <w:bookmarkStart w:id="43" w:name="the-address-map"/>
       <w:bookmarkEnd w:id="42"/>
       <w:r>
@@ -8531,7 +8531,7 @@
         <w:spacing w:before="200" w:after="80"/>
         <w:rPr/>
       </w:pPr>
-      <w:bookmarkStart w:id="44" w:name="__RefHeading___Toc9466_1024129965"/>
+      <w:bookmarkStart w:id="44" w:name="__RefHeading___Toc9446_1952650900"/>
       <w:bookmarkStart w:id="45" w:name="figure-2.2-host-address-map"/>
       <w:bookmarkStart w:id="46" w:name="_Fig_3_Host_address_map"/>
       <w:bookmarkEnd w:id="44"/>
@@ -8652,7 +8652,7 @@
         <w:spacing w:before="280" w:after="80"/>
         <w:rPr/>
       </w:pPr>
-      <w:bookmarkStart w:id="47" w:name="__RefHeading___Toc9468_1024129965"/>
+      <w:bookmarkStart w:id="47" w:name="__RefHeading___Toc9448_1952650900"/>
       <w:bookmarkStart w:id="48" w:name="bridge-slave-map"/>
       <w:bookmarkEnd w:id="47"/>
       <w:r>
@@ -11095,7 +11095,7 @@
         <w:spacing w:before="280" w:after="80"/>
         <w:rPr/>
       </w:pPr>
-      <w:bookmarkStart w:id="50" w:name="__RefHeading___Toc9470_1024129965"/>
+      <w:bookmarkStart w:id="50" w:name="__RefHeading___Toc9450_1952650900"/>
       <w:bookmarkEnd w:id="50"/>
       <w:r>
         <w:rPr>
@@ -15783,7 +15783,7 @@
       <w:r>
         <w:br w:type="page"/>
       </w:r>
-      <w:bookmarkStart w:id="53" w:name="__RefHeading___Toc9472_1024129965"/>
+      <w:bookmarkStart w:id="53" w:name="__RefHeading___Toc9452_1952650900"/>
       <w:bookmarkEnd w:id="53"/>
       <w:r>
         <w:rPr>
@@ -16065,7 +16065,7 @@
         <w:spacing w:before="360" w:after="120"/>
         <w:rPr/>
       </w:pPr>
-      <w:bookmarkStart w:id="55" w:name="__RefHeading___Toc9474_1024129965"/>
+      <w:bookmarkStart w:id="55" w:name="__RefHeading___Toc9454_1952650900"/>
       <w:bookmarkStart w:id="56" w:name="one-rtl-three-builds"/>
       <w:bookmarkEnd w:id="55"/>
       <w:r>
@@ -16097,7 +16097,7 @@
         <w:spacing w:before="280" w:after="80"/>
         <w:rPr/>
       </w:pPr>
-      <w:bookmarkStart w:id="57" w:name="__RefHeading___Toc9476_1024129965"/>
+      <w:bookmarkStart w:id="57" w:name="__RefHeading___Toc9456_1952650900"/>
       <w:bookmarkStart w:id="58" w:name="the-rule"/>
       <w:bookmarkEnd w:id="57"/>
       <w:r>
@@ -17128,7 +17128,7 @@
         <w:spacing w:before="200" w:after="80"/>
         <w:rPr/>
       </w:pPr>
-      <w:bookmarkStart w:id="60" w:name="__RefHeading___Toc9478_1024129965"/>
+      <w:bookmarkStart w:id="60" w:name="__RefHeading___Toc9458_1952650900"/>
       <w:bookmarkStart w:id="61" w:name="Xc226b0c44a2c50f0e553011facdd3c0f482dd71"/>
       <w:bookmarkStart w:id="62" w:name="_Fig_4_One_source_tree__thr"/>
       <w:bookmarkEnd w:id="60"/>
@@ -17250,7 +17250,7 @@
         <w:spacing w:before="280" w:after="80"/>
         <w:rPr/>
       </w:pPr>
-      <w:bookmarkStart w:id="63" w:name="__RefHeading___Toc9480_1024129965"/>
+      <w:bookmarkStart w:id="63" w:name="__RefHeading___Toc9460_1952650900"/>
       <w:bookmarkStart w:id="64" w:name="why-three-and-why-not-two"/>
       <w:bookmarkEnd w:id="63"/>
       <w:r>
@@ -17335,7 +17335,7 @@
         <w:spacing w:before="280" w:after="80"/>
         <w:rPr/>
       </w:pPr>
-      <w:bookmarkStart w:id="66" w:name="__RefHeading___Toc9482_1024129965"/>
+      <w:bookmarkStart w:id="66" w:name="__RefHeading___Toc9462_1952650900"/>
       <w:bookmarkStart w:id="67" w:name="what-the-builds-measured"/>
       <w:bookmarkEnd w:id="66"/>
       <w:r>
@@ -18539,7 +18539,7 @@
         <w:spacing w:before="280" w:after="80"/>
         <w:rPr/>
       </w:pPr>
-      <w:bookmarkStart w:id="69" w:name="__RefHeading___Toc9484_1024129965"/>
+      <w:bookmarkStart w:id="69" w:name="__RefHeading___Toc9464_1952650900"/>
       <w:bookmarkStart w:id="70" w:name="the-knobs-behind-the-rows"/>
       <w:bookmarkEnd w:id="69"/>
       <w:r>
@@ -20202,7 +20202,7 @@
         <w:spacing w:before="360" w:after="120"/>
         <w:rPr/>
       </w:pPr>
-      <w:bookmarkStart w:id="74" w:name="__RefHeading___Toc9486_1024129965"/>
+      <w:bookmarkStart w:id="74" w:name="__RefHeading___Toc9466_1952650900"/>
       <w:bookmarkStart w:id="75" w:name="host-tools-and-flow"/>
       <w:bookmarkEnd w:id="74"/>
       <w:r>
@@ -20234,7 +20234,7 @@
         <w:spacing w:before="280" w:after="80"/>
         <w:rPr/>
       </w:pPr>
-      <w:bookmarkStart w:id="76" w:name="__RefHeading___Toc9488_1024129965"/>
+      <w:bookmarkStart w:id="76" w:name="__RefHeading___Toc9468_1952650900"/>
       <w:bookmarkEnd w:id="76"/>
       <w:r>
         <w:rPr>
@@ -21319,7 +21319,7 @@
       <w:r>
         <w:br w:type="page"/>
       </w:r>
-      <w:bookmarkStart w:id="79" w:name="__RefHeading___Toc9490_1024129965"/>
+      <w:bookmarkStart w:id="79" w:name="__RefHeading___Toc9470_1952650900"/>
       <w:bookmarkEnd w:id="79"/>
       <w:r>
         <w:rPr>
@@ -22170,7 +22170,7 @@
         <w:spacing w:before="200" w:after="80"/>
         <w:rPr/>
       </w:pPr>
-      <w:bookmarkStart w:id="81" w:name="__RefHeading___Toc9492_1024129965"/>
+      <w:bookmarkStart w:id="81" w:name="__RefHeading___Toc9472_1952650900"/>
       <w:bookmarkStart w:id="82" w:name="Xd69c0e83a63449e03c27ce5d7596f669cc080e3"/>
       <w:bookmarkStart w:id="83" w:name="_Fig_5_What_each_build_meas"/>
       <w:bookmarkEnd w:id="81"/>
@@ -22291,7 +22291,7 @@
         <w:spacing w:before="280" w:after="80"/>
         <w:rPr/>
       </w:pPr>
-      <w:bookmarkStart w:id="84" w:name="__RefHeading___Toc9494_1024129965"/>
+      <w:bookmarkStart w:id="84" w:name="__RefHeading___Toc9474_1952650900"/>
       <w:bookmarkStart w:id="85" w:name="one-program-two-targets"/>
       <w:bookmarkEnd w:id="84"/>
       <w:r>
@@ -22364,7 +22364,7 @@
         <w:spacing w:before="280" w:after="80"/>
         <w:rPr/>
       </w:pPr>
-      <w:bookmarkStart w:id="87" w:name="__RefHeading___Toc9496_1024129965"/>
+      <w:bookmarkStart w:id="87" w:name="__RefHeading___Toc9476_1952650900"/>
       <w:bookmarkStart w:id="88" w:name="where-the-results-go"/>
       <w:bookmarkEnd w:id="87"/>
       <w:r>
@@ -23272,7 +23272,7 @@
         <w:spacing w:before="360" w:after="120"/>
         <w:rPr/>
       </w:pPr>
-      <w:bookmarkStart w:id="92" w:name="__RefHeading___Toc9498_1024129965"/>
+      <w:bookmarkStart w:id="92" w:name="__RefHeading___Toc9478_1952650900"/>
       <w:bookmarkEnd w:id="92"/>
       <w:r>
         <w:rPr>
@@ -23337,7 +23337,7 @@
         <w:spacing w:before="280" w:after="80"/>
         <w:rPr/>
       </w:pPr>
-      <w:bookmarkStart w:id="93" w:name="__RefHeading___Toc9500_1024129965"/>
+      <w:bookmarkStart w:id="93" w:name="__RefHeading___Toc9480_1952650900"/>
       <w:bookmarkStart w:id="94" w:name="the-stream-g-build"/>
       <w:bookmarkEnd w:id="93"/>
       <w:r>
@@ -23605,7 +23605,7 @@
         <w:spacing w:before="200" w:after="80"/>
         <w:rPr/>
       </w:pPr>
-      <w:bookmarkStart w:id="95" w:name="__RefHeading___Toc9502_1024129965"/>
+      <w:bookmarkStart w:id="95" w:name="__RefHeading___Toc9482_1952650900"/>
       <w:bookmarkStart w:id="96" w:name="X011e7dd3c447cc524bf276a9bf79e615ec4f16d"/>
       <w:bookmarkStart w:id="97" w:name="_Fig_6_The_stream_g_DUT_in_"/>
       <w:bookmarkEnd w:id="95"/>
@@ -23817,7 +23817,7 @@
         <w:spacing w:before="280" w:after="80"/>
         <w:rPr/>
       </w:pPr>
-      <w:bookmarkStart w:id="98" w:name="__RefHeading___Toc9504_1024129965"/>
+      <w:bookmarkStart w:id="98" w:name="__RefHeading___Toc9484_1952650900"/>
       <w:bookmarkStart w:id="99" w:name="the-two-bitstreams"/>
       <w:bookmarkEnd w:id="98"/>
       <w:r>
@@ -26176,7 +26176,7 @@
         <w:spacing w:before="280" w:after="80"/>
         <w:rPr/>
       </w:pPr>
-      <w:bookmarkStart w:id="102" w:name="__RefHeading___Toc9506_1024129965"/>
+      <w:bookmarkStart w:id="102" w:name="__RefHeading___Toc9486_1952650900"/>
       <w:bookmarkStart w:id="103" w:name="the-first-stream-g-bitstream"/>
       <w:bookmarkEnd w:id="102"/>
       <w:r>
@@ -26301,7 +26301,7 @@
         <w:spacing w:before="280" w:after="80"/>
         <w:rPr/>
       </w:pPr>
-      <w:bookmarkStart w:id="104" w:name="__RefHeading___Toc9508_1024129965"/>
+      <w:bookmarkStart w:id="104" w:name="__RefHeading___Toc9488_1952650900"/>
       <w:bookmarkStart w:id="105" w:name="how-the-two-designs-were-compared"/>
       <w:bookmarkEnd w:id="104"/>
       <w:r>
@@ -26496,7 +26496,7 @@
         <w:spacing w:before="200" w:after="80"/>
         <w:rPr/>
       </w:pPr>
-      <w:bookmarkStart w:id="106" w:name="__RefHeading___Toc9510_1024129965"/>
+      <w:bookmarkStart w:id="106" w:name="__RefHeading___Toc9490_1952650900"/>
       <w:bookmarkStart w:id="107" w:name="figure-5.2-the-ab-end-to-end"/>
       <w:bookmarkStart w:id="108" w:name="_Fig_7_The_A_B__end_to_end"/>
       <w:bookmarkEnd w:id="106"/>
@@ -26611,7 +26611,7 @@
         <w:spacing w:before="200" w:after="80"/>
         <w:rPr/>
       </w:pPr>
-      <w:bookmarkStart w:id="109" w:name="__RefHeading___Toc9512_1024129965"/>
+      <w:bookmarkStart w:id="109" w:name="__RefHeading___Toc9492_1952650900"/>
       <w:bookmarkStart w:id="110" w:name="the-simulation-against-the-board"/>
       <w:bookmarkEnd w:id="109"/>
       <w:r>
@@ -26655,40 +26655,40 @@
         <w:rPr>
           <w:sz w:val="20"/>
         </w:rPr>
-        <w:t>; a first pass had taken the package default and built the in-core monitors in, which is not this bitstream), reproduces the board. On STREAM the first chunk run both ways is the board to the cycle on all eight points (233, 310, 559, 1,071, 2,095, 4,143, 8,239, 16,431 for the lone channel’s chains from 8 to 1,024 beats). On stream-g the traced run of the lone channel’s 16-descriptor chains gives 688 / 1,900 / 1,739 / 2,410 cycles at 16 / 32 / 64 / 128 beats against the board’s 684 / 1,890 / 1,737 / 2,409, and the residue is the design’s own run-to-run spread: the firmware’s poll loop runs free of the host, so where a hart’s pass stands when the kick lands decides whether a chain opens on an in-place advance or on a COMPLETE / NEXT_DESC walk, one walk being about 170 cycles (the board itself gave 1,737 and 1,911-1,935 for the same 64-beat point on different runs, with identical first-read to last-read spans). The simulation trace of channel 0’s scheduler (</w:t>
+        <w:t>; a first pass had taken the package default and built the in-core monitors in, which is not this bitstream), reproduces the board. The full three-profile campaign on both designs (</w:t>
       </w:r>
       <w:r>
         <w:rPr>
           <w:rStyle w:val="VerbatimChar"/>
           <w:sz w:val="20"/>
         </w:rPr>
-        <w:t>bin/sched_trace_timeline.py</w:t>
+        <w:t>make sim-gcompare | sim-gscale | sim-gscale1</w:t>
       </w:r>
       <w:r>
         <w:rPr>
           <w:sz w:val="20"/>
         </w:rPr>
-        <w:t xml:space="preserve">, </w:t>
+        <w:t xml:space="preserve">, 40 cells, </w:t>
       </w:r>
       <w:r>
         <w:rPr>
           <w:rStyle w:val="VerbatimChar"/>
           <w:sz w:val="20"/>
         </w:rPr>
-        <w:t>results/task021_trace_2026-10-24_g.jsonl</w:t>
+        <w:t>results/sim/</w:t>
       </w:r>
       <w:r>
         <w:rPr>
           <w:sz w:val="20"/>
         </w:rPr>
-        <w:t>) is what settled the mechanism behind Table 5.5’s one-channel chain column, recorded under stream TASK-021: from 32 beats up every second chained head is staged after the running descriptor’s last read and walks instead of advancing in place, a 216-cycle pair whatever the size, until the data itself outlasts the firmware’s 26-to-106-cycle reaction above about 96 beats. The full three-profile campaign on both designs (</w:t>
+        <w:t>), on the 2026-10-25 bitstreams: on STREAM all 96 points are the board to the cycle; on stream-g 2 of 96 are identical and the rest differ by 16 cycles on average and 51 at most. That residue is the design’s own: the firmware’s poll loop runs free of the host, so where a hart’s pass stands when a kick lands moves the count by up to a pass. On the first image the same campaign gave 24 cycles on average and 190 at most, one whole COMPLETE / NEXT_DESC walk, because that image’s one-slot poll tested the chain hook only on a pass’s first HEAD_SUM read and a chained head opened mid-pass by the in-place advance fell to JUDGE; the simulation trace of channel 0’s scheduler (</w:t>
       </w:r>
       <w:r>
         <w:rPr>
           <w:rStyle w:val="VerbatimChar"/>
           <w:sz w:val="20"/>
         </w:rPr>
-        <w:t>make sim-gcompare | sim-gscale | sim-gscale1</w:t>
+        <w:t>bin/sched_trace_timeline.py</w:t>
       </w:r>
       <w:r>
         <w:rPr>
@@ -26701,13 +26701,13 @@
           <w:rStyle w:val="VerbatimChar"/>
           <w:sz w:val="20"/>
         </w:rPr>
-        <w:t>results/sim/</w:t>
+        <w:t>results/task021_trace_2026-10-24_g.jsonl</w:t>
       </w:r>
       <w:r>
         <w:rPr>
           <w:sz w:val="20"/>
         </w:rPr>
-        <w:t>): on STREAM all 96 points are the board to the cycle; on stream-g 3 of 96 are identical and the rest differ by 24 cycles on average and 190 at most, every one of them a poll-phase effect, with the largest on the lone channel’s short chains. The reason the firmware’s reaction varies that much is in the one-slot poll of the image stream-g shared with rapids-g on that day: a chained head that opens after the pass’s first HEAD_SUM read is routed to the full JUDGE path instead of the four- instruction chain hook, and in stream-g a chained head opens at the hardware’s in-place advance, out of phase with the pass, where in rapids-g it opens at the firmware’s own take (TASK-021).</w:t>
+        <w:t>) is what found it, and STREAM’s own firmware tests the hook on both reads (stream TASK-021: lone channel, 16-descriptor chains at 16 / 32 / 64 / 128 beats, board 704 / 1,126 / 1,319 / 2,199 cycles, simulation 688 / 1,132 / 1,312 / 2,196).</w:t>
       </w:r>
       <w:bookmarkEnd w:id="105"/>
       <w:bookmarkEnd w:id="110"/>
@@ -26724,7 +26724,7 @@
         <w:spacing w:before="280" w:after="80"/>
         <w:rPr/>
       </w:pPr>
-      <w:bookmarkStart w:id="111" w:name="__RefHeading___Toc9514_1024129965"/>
+      <w:bookmarkStart w:id="111" w:name="__RefHeading___Toc9494_1952650900"/>
       <w:bookmarkEnd w:id="111"/>
       <w:r>
         <w:rPr>
@@ -36143,7 +36143,7 @@
       <w:r>
         <w:br w:type="page"/>
       </w:r>
-      <w:bookmarkStart w:id="114" w:name="__RefHeading___Toc9516_1024129965"/>
+      <w:bookmarkStart w:id="114" w:name="__RefHeading___Toc9496_1952650900"/>
       <w:bookmarkEnd w:id="114"/>
       <w:r>
         <w:rPr>
@@ -38532,7 +38532,7 @@
       <w:r>
         <w:br w:type="page"/>
       </w:r>
-      <w:bookmarkStart w:id="116" w:name="__RefHeading___Toc9518_1024129965"/>
+      <w:bookmarkStart w:id="116" w:name="__RefHeading___Toc9498_1952650900"/>
       <w:bookmarkEnd w:id="116"/>
       <w:r>
         <w:rPr>
@@ -42993,7 +42993,7 @@
         <w:spacing w:before="280" w:after="80"/>
         <w:rPr/>
       </w:pPr>
-      <w:bookmarkStart w:id="119" w:name="__RefHeading___Toc9520_1024129965"/>
+      <w:bookmarkStart w:id="119" w:name="__RefHeading___Toc9500_1952650900"/>
       <w:bookmarkEnd w:id="119"/>
       <w:r>
         <w:rPr>
@@ -43871,7 +43871,7 @@
       <w:r>
         <w:br w:type="page"/>
       </w:r>
-      <w:bookmarkStart w:id="122" w:name="__RefHeading___Toc9522_1024129965"/>
+      <w:bookmarkStart w:id="122" w:name="__RefHeading___Toc9502_1952650900"/>
       <w:bookmarkEnd w:id="122"/>
       <w:r>
         <w:rPr>

</xml_diff>